<commit_message>
Finalize V2 research-grade literature agent
</commit_message>
<xml_diff>
--- a/multi_agent_lit_review/Comprehensive_Review_Updated_2026_09_11.docx
+++ b/multi_agent_lit_review/Comprehensive_Review_Updated_2026_09_11.docx
@@ -13,11 +13,11 @@
     </w:p>
     <w:p>
       <w:r>
-        <w:t>Generated Date: 2026-09-11 10:15:55</w:t>
+        <w:t>Generated Date: 2026-09-11 14:24:29</w:t>
         <w:br/>
       </w:r>
       <w:r>
-        <w:t>Total Validated Papers: 50</w:t>
+        <w:t>Total Validated Papers: 47</w:t>
         <w:br/>
       </w:r>
       <w:r>
@@ -2754,174 +2754,6 @@
           </w:p>
         </w:tc>
       </w:tr>
-      <w:tr>
-        <w:tc>
-          <w:tcPr>
-            <w:tcW w:type="dxa" w:w="3168"/>
-          </w:tcPr>
-          <w:p>
-            <w:r>
-              <w:t>Extended Abstract: Explainable Agency in Ad hoc Collaboration between Humans and Embodied AI</w:t>
-            </w:r>
-          </w:p>
-        </w:tc>
-        <w:tc>
-          <w:tcPr>
-            <w:tcW w:type="dxa" w:w="2160"/>
-          </w:tcPr>
-          <w:p>
-            <w:r>
-              <w:t>Dodampegama H.</w:t>
-              <w:br/>
-              <w:t>(2026)</w:t>
-            </w:r>
-          </w:p>
-        </w:tc>
-        <w:tc>
-          <w:tcPr>
-            <w:tcW w:type="dxa" w:w="2160"/>
-          </w:tcPr>
-          <w:p>
-            <w:r>
-              <w:t>None</w:t>
-              <w:br/>
-              <w:t>[OFFLINE / DEMO DATA]</w:t>
-            </w:r>
-          </w:p>
-        </w:tc>
-        <w:tc>
-          <w:tcPr>
-            <w:tcW w:type="dxa" w:w="1728"/>
-          </w:tcPr>
-          <w:p>
-            <w:r>
-              <w:t>General Literature</w:t>
-            </w:r>
-          </w:p>
-        </w:tc>
-        <w:tc>
-          <w:tcPr>
-            <w:tcW w:type="dxa" w:w="3744"/>
-          </w:tcPr>
-          <w:p>
-            <w:r>
-              <w:t>Extended Abstract: Explainable Agency in Ad hoc Collaboration between Humans and Embodied AI...</w:t>
-            </w:r>
-          </w:p>
-        </w:tc>
-      </w:tr>
-      <w:tr>
-        <w:tc>
-          <w:tcPr>
-            <w:tcW w:type="dxa" w:w="3168"/>
-          </w:tcPr>
-          <w:p>
-            <w:r>
-              <w:t>An LLM-enhanced Agent-Based Model of a Sustainability Game</w:t>
-            </w:r>
-          </w:p>
-        </w:tc>
-        <w:tc>
-          <w:tcPr>
-            <w:tcW w:type="dxa" w:w="2160"/>
-          </w:tcPr>
-          <w:p>
-            <w:r>
-              <w:t>Bertolotti F.</w:t>
-              <w:br/>
-              <w:t>(2025)</w:t>
-            </w:r>
-          </w:p>
-        </w:tc>
-        <w:tc>
-          <w:tcPr>
-            <w:tcW w:type="dxa" w:w="2160"/>
-          </w:tcPr>
-          <w:p>
-            <w:r>
-              <w:t>None</w:t>
-              <w:br/>
-              <w:t>[OFFLINE / DEMO DATA]</w:t>
-            </w:r>
-          </w:p>
-        </w:tc>
-        <w:tc>
-          <w:tcPr>
-            <w:tcW w:type="dxa" w:w="1728"/>
-          </w:tcPr>
-          <w:p>
-            <w:r>
-              <w:t>Direct</w:t>
-            </w:r>
-          </w:p>
-        </w:tc>
-        <w:tc>
-          <w:tcPr>
-            <w:tcW w:type="dxa" w:w="3744"/>
-          </w:tcPr>
-          <w:p>
-            <w:r>
-              <w:t>An LLM-enhanced Agent-Based Model of a Sustainability Game...</w:t>
-            </w:r>
-          </w:p>
-        </w:tc>
-      </w:tr>
-      <w:tr>
-        <w:tc>
-          <w:tcPr>
-            <w:tcW w:type="dxa" w:w="3168"/>
-          </w:tcPr>
-          <w:p>
-            <w:r>
-              <w:t>Combining Cognitive and Generative AI for Self-explanation in Interactive AI Agents</w:t>
-            </w:r>
-          </w:p>
-        </w:tc>
-        <w:tc>
-          <w:tcPr>
-            <w:tcW w:type="dxa" w:w="2160"/>
-          </w:tcPr>
-          <w:p>
-            <w:r>
-              <w:t>Sushri S.</w:t>
-              <w:br/>
-              <w:t>(2024)</w:t>
-            </w:r>
-          </w:p>
-        </w:tc>
-        <w:tc>
-          <w:tcPr>
-            <w:tcW w:type="dxa" w:w="2160"/>
-          </w:tcPr>
-          <w:p>
-            <w:r>
-              <w:t>None</w:t>
-              <w:br/>
-              <w:t>[OFFLINE / DEMO DATA]</w:t>
-            </w:r>
-          </w:p>
-        </w:tc>
-        <w:tc>
-          <w:tcPr>
-            <w:tcW w:type="dxa" w:w="1728"/>
-          </w:tcPr>
-          <w:p>
-            <w:r>
-              <w:t>Methodological</w:t>
-            </w:r>
-          </w:p>
-        </w:tc>
-        <w:tc>
-          <w:tcPr>
-            <w:tcW w:type="dxa" w:w="3744"/>
-          </w:tcPr>
-          <w:p>
-            <w:r>
-              <w:t>Combining Cognitive and Generative AI for Self-explanation in Interactive AI Agents...</w:t>
-            </w:r>
-          </w:p>
-        </w:tc>
-      </w:tr>
     </w:tbl>
     <w:sectPr>
       <w:pgSz w:w="12240" w:h="15840"/>

</xml_diff>